<commit_message>
P2023-10-14 — polimento da apostila: contadores no padrão da casa (136.087 / 5.222) e SHA-256 abreviado no cabeçalho, com o hash integral remetido a METADADOS-INGRESSO.json
Co-authored-by: arena-agent <297053741+arena-agent@users.noreply.github.com>
</commit_message>
<xml_diff>
--- a/apostilas/CONCLUIDAS/2023-10-14_a_esquecida_honra_dos_anunnaki/Apostila - A Esquecida Honra dos Anunnaki.docx
+++ b/apostilas/CONCLUIDAS/2023-10-14_a_esquecida_honra_dos_anunnaki/Apostila - A Esquecida Honra dos Anunnaki.docx
@@ -246,7 +246,7 @@
         <w:rPr>
           <w:sz w:val="21"/>
         </w:rPr>
-        <w:t>Transcrição integral publicada: **136087 de 141309 caracteres** da fala (**96.30%**), menos **5222 caracteres** suprimidos nos **11 trechos bloqueados** por determinação curatorial (item 10), cada um substituído por marcador no próprio lugar. O auditor `_cobertura_apostila.py` confere o texto parágrafo a parágrafo e reproduce a mesma contagem.</w:t>
+        <w:t>Transcrição integral publicada: **136.087 de 141.309 caracteres** da fala (**96.30%**), menos **5.222 caracteres** suprimidos nos **11 trechos bloqueados** por determinação curatorial (item 10), cada um substituído por marcador no próprio lugar. O auditor `_cobertura_apostila.py` confere o texto parágrafo a parágrafo e reproduce a mesma contagem.</w:t>
       </w:r>
     </w:p>
     <w:p>
@@ -293,7 +293,7 @@
         <w:rPr>
           <w:sz w:val="21"/>
         </w:rPr>
-        <w:t>**U0081** — quarentena política e institucional/segurança — alegações sobre estruturas de governo, verba sigilosa, arquivos liberados por lei de acesso e o papel da imprensa; inclui a tese de «parceria» já negociada — **2117 caracteres** suprimidos no ponto (as âncoras do recorte ficam apenas no gerador, para que nenhum fragmento do teor bloqueado reapareça aqui como exemplo).</w:t>
+        <w:t>**U0081** — quarentena política e institucional/segurança — alegações sobre estruturas de governo, verba sigilosa, arquivos liberados por lei de acesso e o papel da imprensa; inclui a tese de «parceria» já negociada — **2.117 caracteres** suprimidos no ponto (as âncoras do recorte ficam apenas no gerador, para que nenhum fragmento do teor bloqueado reapareça aqui como exemplo).</w:t>
       </w:r>
     </w:p>
     <w:p>
@@ -341,7 +341,7 @@
         <w:rPr>
           <w:sz w:val="21"/>
         </w:rPr>
-        <w:t>**U0071** — quarentena política e «deep state» — a nomeação das estruturas que mandariam abaixo dos governos visíveis, com elenco de famílias e de empresas (a recusa do autor à premissa, que vem logo depois, é preservada: é o único enunciado do bloco que a **desmonta**) — **1585 caracteres** suprimidos no ponto (as âncoras do recorte ficam apenas no gerador, para que nenhum fragmento do teor bloqueado reapareça aqui como exemplo).</w:t>
+        <w:t>**U0071** — quarentena política e «deep state» — a nomeação das estruturas que mandariam abaixo dos governos visíveis, com elenco de famílias e de empresas (a recusa do autor à premissa, que vem logo depois, é preservada: é o único enunciado do bloco que a **desmonta**) — **1.585 caracteres** suprimidos no ponto (as âncoras do recorte ficam apenas no gerador, para que nenhum fragmento do teor bloqueado reapareça aqui como exemplo).</w:t>
       </w:r>
     </w:p>
     <w:p>

</xml_diff>